<commit_message>
Reancora os CTAs dos e-mails de setembro em artigos já publicados
Os três botões apontavam para textos ainda não produzidos. Cada e-mail
passa a levar para um artigo pronto do plano editorial, com a ponte
reescrita para que a promessa do CTA corresponda ao conteúdo de destino:

- E-mail 1: credenciamento exigido pelo Conecta Muralha como critério de
  escolha de fornecedor, levando ao guia de contratação
- E-mail 2: da cena de invasão ao guia de projeto de CFTV empresarial
- E-mail 3: qualidade de imagem nos acessos como pré-requisito, levando
  ao guia de falhas de segurança em condomínios

Inclui tabela de destinos com URLs e nota sobre migração futura dos CTAs.

Co-Authored-By: Claude Opus 5 <noreply@anthropic.com>
Claude-Session: https://claude.ai/code/session_011Ls9e1ya7pUeqY3wg4Purw
</commit_message>
<xml_diff>
--- a/clientes/g5-seguranca/email/G5-Seguranca-Emails-Setembro.docx
+++ b/clientes/g5-seguranca/email/G5-Seguranca-Emails-Setembro.docx
@@ -887,7 +887,7 @@
                 <w:sz w:val="20"/>
                 <w:szCs w:val="20"/>
               </w:rPr>
-              <w:t xml:space="preserve">Conecta Muralha: como funciona a integração</w:t>
+              <w:t xml:space="preserve">Como escolher uma empresa de segurança confiável</w:t>
             </w:r>
           </w:p>
         </w:tc>
@@ -1014,7 +1014,7 @@
                 <w:sz w:val="20"/>
                 <w:szCs w:val="20"/>
               </w:rPr>
-              <w:t xml:space="preserve">Leitura de placas e análise inteligente de vídeo</w:t>
+              <w:t xml:space="preserve">CFTV empresarial: como planejar</w:t>
             </w:r>
           </w:p>
         </w:tc>
@@ -1146,7 +1146,7 @@
                 <w:sz w:val="20"/>
                 <w:szCs w:val="20"/>
               </w:rPr>
-              <w:t xml:space="preserve">Meu condomínio pode integrar as câmeras?</w:t>
+              <w:t xml:space="preserve">Como melhorar a segurança do condomínio</w:t>
             </w:r>
           </w:p>
         </w:tc>
@@ -1156,6 +1156,401 @@
       <w:pPr>
         <w:spacing w:after="200"/>
       </w:pPr>
+    </w:p>
+    <w:p>
+      <w:pPr>
+        <w:pStyle w:val="Heading2"/>
+        <w:spacing w:after="140" w:before="280"/>
+      </w:pPr>
+      <w:r>
+        <w:rPr>
+          <w:b/>
+          <w:bCs/>
+          <w:color w:val="1F3864"/>
+          <w:sz w:val="26"/>
+          <w:szCs w:val="26"/>
+        </w:rPr>
+        <w:t xml:space="preserve">Para onde cada botão aponta</w:t>
+      </w:r>
+    </w:p>
+    <w:p>
+      <w:pPr>
+        <w:spacing w:after="140" w:line="300"/>
+        <w:jc w:val="both"/>
+      </w:pPr>
+      <w:r>
+        <w:rPr>
+          <w:b w:val="false"/>
+          <w:bCs w:val="false"/>
+          <w:i w:val="false"/>
+          <w:iCs w:val="false"/>
+          <w:color w:val="000000"/>
+          <w:sz w:val="22"/>
+          <w:szCs w:val="22"/>
+        </w:rPr>
+        <w:t xml:space="preserve">Todos os CTAs levam a textos que já estão prontos e revisados. Nenhum e-mail depende de conteúdo novo para ser disparado.</w:t>
+      </w:r>
+    </w:p>
+    <w:tbl>
+      <w:tblPr>
+        <w:tblW w:type="dxa" w:w="9000"/>
+        <w:tblBorders>
+          <w:top w:val="single" w:color="BFBFBF" w:sz="4"/>
+          <w:left w:val="single" w:color="BFBFBF" w:sz="4"/>
+          <w:bottom w:val="single" w:color="BFBFBF" w:sz="4"/>
+          <w:right w:val="single" w:color="BFBFBF" w:sz="4"/>
+          <w:insideH w:val="single" w:color="BFBFBF" w:sz="2"/>
+          <w:insideV w:val="single" w:color="BFBFBF" w:sz="2"/>
+        </w:tblBorders>
+      </w:tblPr>
+      <w:tblGrid>
+        <w:gridCol w:w="3000"/>
+        <w:gridCol w:w="3000"/>
+        <w:gridCol w:w="3000"/>
+      </w:tblGrid>
+      <w:tr>
+        <w:trPr>
+          <w:tblHeader/>
+        </w:trPr>
+        <w:tc>
+          <w:tcPr>
+            <w:tcW w:type="dxa" w:w="3000"/>
+            <w:shd w:fill="1F3864" w:color="auto" w:val="clear"/>
+            <w:tcMar>
+              <w:top w:type="dxa" w:w="80"/>
+              <w:left w:type="dxa" w:w="120"/>
+              <w:bottom w:type="dxa" w:w="80"/>
+              <w:right w:type="dxa" w:w="120"/>
+            </w:tcMar>
+          </w:tcPr>
+          <w:p>
+            <w:r>
+              <w:rPr>
+                <w:b/>
+                <w:bCs/>
+                <w:i w:val="false"/>
+                <w:iCs w:val="false"/>
+                <w:color w:val="FFFFFF"/>
+                <w:sz w:val="20"/>
+                <w:szCs w:val="20"/>
+              </w:rPr>
+              <w:t xml:space="preserve">E-mail</w:t>
+            </w:r>
+          </w:p>
+        </w:tc>
+        <w:tc>
+          <w:tcPr>
+            <w:tcW w:type="dxa" w:w="3000"/>
+            <w:shd w:fill="1F3864" w:color="auto" w:val="clear"/>
+            <w:tcMar>
+              <w:top w:type="dxa" w:w="80"/>
+              <w:left w:type="dxa" w:w="120"/>
+              <w:bottom w:type="dxa" w:w="80"/>
+              <w:right w:type="dxa" w:w="120"/>
+            </w:tcMar>
+          </w:tcPr>
+          <w:p>
+            <w:r>
+              <w:rPr>
+                <w:b/>
+                <w:bCs/>
+                <w:i w:val="false"/>
+                <w:iCs w:val="false"/>
+                <w:color w:val="FFFFFF"/>
+                <w:sz w:val="20"/>
+                <w:szCs w:val="20"/>
+              </w:rPr>
+              <w:t xml:space="preserve">Artigo de destino</w:t>
+            </w:r>
+          </w:p>
+        </w:tc>
+        <w:tc>
+          <w:tcPr>
+            <w:tcW w:type="dxa" w:w="3000"/>
+            <w:shd w:fill="1F3864" w:color="auto" w:val="clear"/>
+            <w:tcMar>
+              <w:top w:type="dxa" w:w="80"/>
+              <w:left w:type="dxa" w:w="120"/>
+              <w:bottom w:type="dxa" w:w="80"/>
+              <w:right w:type="dxa" w:w="120"/>
+            </w:tcMar>
+          </w:tcPr>
+          <w:p>
+            <w:r>
+              <w:rPr>
+                <w:b/>
+                <w:bCs/>
+                <w:i w:val="false"/>
+                <w:iCs w:val="false"/>
+                <w:color w:val="FFFFFF"/>
+                <w:sz w:val="20"/>
+                <w:szCs w:val="20"/>
+              </w:rPr>
+              <w:t xml:space="preserve">URL</w:t>
+            </w:r>
+          </w:p>
+        </w:tc>
+      </w:tr>
+      <w:tr>
+        <w:tc>
+          <w:tcPr>
+            <w:tcW w:type="dxa" w:w="3000"/>
+            <w:shd w:fill="F2F2F2" w:color="auto" w:val="clear"/>
+            <w:tcMar>
+              <w:top w:type="dxa" w:w="80"/>
+              <w:left w:type="dxa" w:w="120"/>
+              <w:bottom w:type="dxa" w:w="80"/>
+              <w:right w:type="dxa" w:w="120"/>
+            </w:tcMar>
+          </w:tcPr>
+          <w:p>
+            <w:r>
+              <w:rPr>
+                <w:b w:val="false"/>
+                <w:bCs w:val="false"/>
+                <w:i w:val="false"/>
+                <w:iCs w:val="false"/>
+                <w:color w:val="333333"/>
+                <w:sz w:val="20"/>
+                <w:szCs w:val="20"/>
+              </w:rPr>
+              <w:t xml:space="preserve">1</w:t>
+            </w:r>
+          </w:p>
+        </w:tc>
+        <w:tc>
+          <w:tcPr>
+            <w:tcW w:type="dxa" w:w="3000"/>
+            <w:shd w:fill="F2F2F2" w:color="auto" w:val="clear"/>
+            <w:tcMar>
+              <w:top w:type="dxa" w:w="80"/>
+              <w:left w:type="dxa" w:w="120"/>
+              <w:bottom w:type="dxa" w:w="80"/>
+              <w:right w:type="dxa" w:w="120"/>
+            </w:tcMar>
+          </w:tcPr>
+          <w:p>
+            <w:r>
+              <w:rPr>
+                <w:b w:val="false"/>
+                <w:bCs w:val="false"/>
+                <w:i w:val="false"/>
+                <w:iCs w:val="false"/>
+                <w:color w:val="333333"/>
+                <w:sz w:val="20"/>
+                <w:szCs w:val="20"/>
+              </w:rPr>
+              <w:t xml:space="preserve">Como escolher uma empresa de segurança confiável</w:t>
+            </w:r>
+          </w:p>
+        </w:tc>
+        <w:tc>
+          <w:tcPr>
+            <w:tcW w:type="dxa" w:w="3000"/>
+            <w:shd w:fill="F2F2F2" w:color="auto" w:val="clear"/>
+            <w:tcMar>
+              <w:top w:type="dxa" w:w="80"/>
+              <w:left w:type="dxa" w:w="120"/>
+              <w:bottom w:type="dxa" w:w="80"/>
+              <w:right w:type="dxa" w:w="120"/>
+            </w:tcMar>
+          </w:tcPr>
+          <w:p>
+            <w:r>
+              <w:rPr>
+                <w:b w:val="false"/>
+                <w:bCs w:val="false"/>
+                <w:i w:val="false"/>
+                <w:iCs w:val="false"/>
+                <w:color w:val="333333"/>
+                <w:sz w:val="20"/>
+                <w:szCs w:val="20"/>
+              </w:rPr>
+              <w:t xml:space="preserve">/blog/como-escolher-empresa-de-seguranca-confiavel</w:t>
+            </w:r>
+          </w:p>
+        </w:tc>
+      </w:tr>
+      <w:tr>
+        <w:tc>
+          <w:tcPr>
+            <w:tcW w:type="dxa" w:w="3000"/>
+            <w:tcMar>
+              <w:top w:type="dxa" w:w="80"/>
+              <w:left w:type="dxa" w:w="120"/>
+              <w:bottom w:type="dxa" w:w="80"/>
+              <w:right w:type="dxa" w:w="120"/>
+            </w:tcMar>
+          </w:tcPr>
+          <w:p>
+            <w:r>
+              <w:rPr>
+                <w:b w:val="false"/>
+                <w:bCs w:val="false"/>
+                <w:i w:val="false"/>
+                <w:iCs w:val="false"/>
+                <w:color w:val="333333"/>
+                <w:sz w:val="20"/>
+                <w:szCs w:val="20"/>
+              </w:rPr>
+              <w:t xml:space="preserve">2</w:t>
+            </w:r>
+          </w:p>
+        </w:tc>
+        <w:tc>
+          <w:tcPr>
+            <w:tcW w:type="dxa" w:w="3000"/>
+            <w:tcMar>
+              <w:top w:type="dxa" w:w="80"/>
+              <w:left w:type="dxa" w:w="120"/>
+              <w:bottom w:type="dxa" w:w="80"/>
+              <w:right w:type="dxa" w:w="120"/>
+            </w:tcMar>
+          </w:tcPr>
+          <w:p>
+            <w:r>
+              <w:rPr>
+                <w:b w:val="false"/>
+                <w:bCs w:val="false"/>
+                <w:i w:val="false"/>
+                <w:iCs w:val="false"/>
+                <w:color w:val="333333"/>
+                <w:sz w:val="20"/>
+                <w:szCs w:val="20"/>
+              </w:rPr>
+              <w:t xml:space="preserve">CFTV empresarial: como planejar câmeras, gravação e monitoramento</w:t>
+            </w:r>
+          </w:p>
+        </w:tc>
+        <w:tc>
+          <w:tcPr>
+            <w:tcW w:type="dxa" w:w="3000"/>
+            <w:tcMar>
+              <w:top w:type="dxa" w:w="80"/>
+              <w:left w:type="dxa" w:w="120"/>
+              <w:bottom w:type="dxa" w:w="80"/>
+              <w:right w:type="dxa" w:w="120"/>
+            </w:tcMar>
+          </w:tcPr>
+          <w:p>
+            <w:r>
+              <w:rPr>
+                <w:b w:val="false"/>
+                <w:bCs w:val="false"/>
+                <w:i w:val="false"/>
+                <w:iCs w:val="false"/>
+                <w:color w:val="333333"/>
+                <w:sz w:val="20"/>
+                <w:szCs w:val="20"/>
+              </w:rPr>
+              <w:t xml:space="preserve">/blog/cftv-empresarial-como-planejar</w:t>
+            </w:r>
+          </w:p>
+        </w:tc>
+      </w:tr>
+      <w:tr>
+        <w:tc>
+          <w:tcPr>
+            <w:tcW w:type="dxa" w:w="3000"/>
+            <w:shd w:fill="F2F2F2" w:color="auto" w:val="clear"/>
+            <w:tcMar>
+              <w:top w:type="dxa" w:w="80"/>
+              <w:left w:type="dxa" w:w="120"/>
+              <w:bottom w:type="dxa" w:w="80"/>
+              <w:right w:type="dxa" w:w="120"/>
+            </w:tcMar>
+          </w:tcPr>
+          <w:p>
+            <w:r>
+              <w:rPr>
+                <w:b w:val="false"/>
+                <w:bCs w:val="false"/>
+                <w:i w:val="false"/>
+                <w:iCs w:val="false"/>
+                <w:color w:val="333333"/>
+                <w:sz w:val="20"/>
+                <w:szCs w:val="20"/>
+              </w:rPr>
+              <w:t xml:space="preserve">3</w:t>
+            </w:r>
+          </w:p>
+        </w:tc>
+        <w:tc>
+          <w:tcPr>
+            <w:tcW w:type="dxa" w:w="3000"/>
+            <w:shd w:fill="F2F2F2" w:color="auto" w:val="clear"/>
+            <w:tcMar>
+              <w:top w:type="dxa" w:w="80"/>
+              <w:left w:type="dxa" w:w="120"/>
+              <w:bottom w:type="dxa" w:w="80"/>
+              <w:right w:type="dxa" w:w="120"/>
+            </w:tcMar>
+          </w:tcPr>
+          <w:p>
+            <w:r>
+              <w:rPr>
+                <w:b w:val="false"/>
+                <w:bCs w:val="false"/>
+                <w:i w:val="false"/>
+                <w:iCs w:val="false"/>
+                <w:color w:val="333333"/>
+                <w:sz w:val="20"/>
+                <w:szCs w:val="20"/>
+              </w:rPr>
+              <w:t xml:space="preserve">Como melhorar a segurança do condomínio</w:t>
+            </w:r>
+          </w:p>
+        </w:tc>
+        <w:tc>
+          <w:tcPr>
+            <w:tcW w:type="dxa" w:w="3000"/>
+            <w:shd w:fill="F2F2F2" w:color="auto" w:val="clear"/>
+            <w:tcMar>
+              <w:top w:type="dxa" w:w="80"/>
+              <w:left w:type="dxa" w:w="120"/>
+              <w:bottom w:type="dxa" w:w="80"/>
+              <w:right w:type="dxa" w:w="120"/>
+            </w:tcMar>
+          </w:tcPr>
+          <w:p>
+            <w:r>
+              <w:rPr>
+                <w:b w:val="false"/>
+                <w:bCs w:val="false"/>
+                <w:i w:val="false"/>
+                <w:iCs w:val="false"/>
+                <w:color w:val="333333"/>
+                <w:sz w:val="20"/>
+                <w:szCs w:val="20"/>
+              </w:rPr>
+              <w:t xml:space="preserve">/blog/como-melhorar-seguranca-do-condominio</w:t>
+            </w:r>
+          </w:p>
+        </w:tc>
+      </w:tr>
+    </w:tbl>
+    <w:p>
+      <w:pPr>
+        <w:spacing w:after="200"/>
+      </w:pPr>
+    </w:p>
+    <w:p>
+      <w:pPr>
+        <w:spacing w:after="140" w:line="300"/>
+        <w:jc w:val="both"/>
+      </w:pPr>
+      <w:r>
+        <w:rPr>
+          <w:b w:val="false"/>
+          <w:bCs w:val="false"/>
+          <w:i w:val="false"/>
+          <w:iCs w:val="false"/>
+          <w:color w:val="000000"/>
+          <w:sz w:val="22"/>
+          <w:szCs w:val="22"/>
+        </w:rPr>
+        <w:t xml:space="preserve">O tema da Muralha Digital continua sendo o gancho de abertura dos três e-mails, porque é o que diferencia a G5 no momento. O que muda é o destino do clique: em vez de prometer um guia que ainda não existe, cada e-mail entrega a informação da Muralha no próprio corpo e leva o leitor para um conteúdo publicado que responde à pergunta seguinte.</w:t>
+      </w:r>
     </w:p>
     <w:p>
       <w:pPr>
@@ -1516,7 +1911,25 @@
           <w:sz w:val="22"/>
           <w:szCs w:val="22"/>
         </w:rPr>
-        <w:t xml:space="preserve">Escrevemos um guia explicando o programa por inteiro: quem pode participar, o que a Prefeitura passa a ver, o que continua fora do acesso dela e o que muda no tempo de resposta a uma ocorrência.</w:t>
+        <w:t xml:space="preserve">Repare no que esses requisitos revelam. Uma empresa que não é credenciada na Polícia Federal, que não tem projeto técnico em ordem e que não consegue aprovar uma análise da Prefeitura simplesmente não integra nada. O programa acabou virando um filtro de qualidade de fornecedor, e vale usar esse critério mesmo que você não pretenda integrar câmera nenhuma.</w:t>
+      </w:r>
+    </w:p>
+    <w:p>
+      <w:pPr>
+        <w:spacing w:after="140" w:line="300"/>
+        <w:jc w:val="both"/>
+      </w:pPr>
+      <w:r>
+        <w:rPr>
+          <w:b w:val="false"/>
+          <w:bCs w:val="false"/>
+          <w:i w:val="false"/>
+          <w:iCs w:val="false"/>
+          <w:color w:val="000000"/>
+          <w:sz w:val="22"/>
+          <w:szCs w:val="22"/>
+        </w:rPr>
+        <w:t xml:space="preserve">Reunimos em um guia os pontos que separam uma empresa de segurança preparada de uma que vende equipamento com mensalidade: central própria ou terceirizada, protocolo de atendimento por escrito, escopo real de manutenção e o que perguntar antes de assinar.</w:t>
       </w:r>
     </w:p>
     <w:p>
@@ -1533,7 +1946,7 @@
           <w:sz w:val="22"/>
           <w:szCs w:val="22"/>
         </w:rPr>
-        <w:t xml:space="preserve">BOTÃO: Ler o guia do Conecta Muralha</w:t>
+        <w:t xml:space="preserve">BOTÃO: Ver os critérios para avaliar sua empresa de segurança</w:t>
       </w:r>
     </w:p>
     <w:p>
@@ -1625,7 +2038,7 @@
           <w:sz w:val="20"/>
           <w:szCs w:val="20"/>
         </w:rPr>
-        <w:t xml:space="preserve">P.S. A dúvida mais comum que recebemos é se a Prefeitura passa a enxergar o interior do imóvel. Não passa. O guia explica exatamente onde fica esse limite.</w:t>
+        <w:t xml:space="preserve">P.S. A dúvida mais comum que recebemos é se a Prefeitura passa a enxergar o interior do imóvel. Não passa: a integração mira o espaço público. Se quiser entender como isso se aplica à sua operação, responda este e-mail que eu explico.</w:t>
       </w:r>
     </w:p>
     <w:p>
@@ -2071,7 +2484,7 @@
           <w:sz w:val="22"/>
           <w:szCs w:val="22"/>
         </w:rPr>
-        <w:t xml:space="preserve">Explicamos no blog o que a tecnologia detecta de fato, o que ainda depende de operador humano e onde ela não funciona bem, porque isso também precisa ser dito.</w:t>
+        <w:t xml:space="preserve">Escrevemos um guia de projeto de CFTV empresarial que trata exatamente disso: como definir a função de cada câmera antes de comprar, o que a análise inteligente detecta de fato, quanto tempo de gravação faz sentido guardar e os erros que fazem um sistema inteiro deixar de servir justamente no dia em que ele é necessário.</w:t>
       </w:r>
     </w:p>
     <w:p>
@@ -2088,7 +2501,7 @@
           <w:sz w:val="22"/>
           <w:szCs w:val="22"/>
         </w:rPr>
-        <w:t xml:space="preserve">BOTÃO: Entender como funciona a análise inteligente</w:t>
+        <w:t xml:space="preserve">BOTÃO: Ler o guia de CFTV empresarial</w:t>
       </w:r>
     </w:p>
     <w:p>
@@ -2578,7 +2991,25 @@
           <w:sz w:val="22"/>
           <w:szCs w:val="22"/>
         </w:rPr>
-        <w:t xml:space="preserve">Preparamos um guia com o passo a passo completo, incluindo o que precisa constar na pauta da assembleia.</w:t>
+        <w:t xml:space="preserve">Antes do formulário da Prefeitura, porém, vem uma pergunta mais simples: as câmeras do seu condomínio identificam placa e rosto nos acessos? Câmera que não identifica não serve para a integração, e também não serve para o condomínio.</w:t>
+      </w:r>
+    </w:p>
+    <w:p>
+      <w:pPr>
+        <w:spacing w:after="140" w:line="300"/>
+        <w:jc w:val="both"/>
+      </w:pPr>
+      <w:r>
+        <w:rPr>
+          <w:b w:val="false"/>
+          <w:bCs w:val="false"/>
+          <w:i w:val="false"/>
+          <w:iCs w:val="false"/>
+          <w:color w:val="000000"/>
+          <w:sz w:val="22"/>
+          <w:szCs w:val="22"/>
+        </w:rPr>
+        <w:t xml:space="preserve">Reunimos em um guia as falhas de segurança que mais aparecem em condomínios de Curitiba, com a ordem de correção que dá mais resultado por menos investimento. É por aí que a conversa começa.</w:t>
       </w:r>
     </w:p>
     <w:p>
@@ -2595,7 +3026,7 @@
           <w:sz w:val="22"/>
           <w:szCs w:val="22"/>
         </w:rPr>
-        <w:t xml:space="preserve">BOTÃO: Ver o passo a passo para o condomínio</w:t>
+        <w:t xml:space="preserve">BOTÃO: Ver as falhas mais comuns na segurança de condomínios</w:t>
       </w:r>
     </w:p>
     <w:p>
@@ -2857,6 +3288,66 @@
           <w:szCs w:val="22"/>
         </w:rPr>
         <w:t xml:space="preserve"> taxa de abertura por linha de assunto testada, cliques no botão principal, respostas diretas ao e-mail (o indicador mais forte de intenção neste setor) e visitas ao blog vindas da campanha. Descadastros acima de 0,5% em um disparo indicam problema de segmentação, não de conteúdo.</w:t>
+      </w:r>
+    </w:p>
+    <w:p>
+      <w:pPr>
+        <w:spacing w:after="140" w:line="300"/>
+        <w:jc w:val="both"/>
+      </w:pPr>
+      <w:r>
+        <w:rPr>
+          <w:b/>
+          <w:bCs/>
+          <w:i w:val="false"/>
+          <w:iCs w:val="false"/>
+          <w:color w:val="000000"/>
+          <w:sz w:val="22"/>
+          <w:szCs w:val="22"/>
+        </w:rPr>
+        <w:t xml:space="preserve">Links:</w:t>
+      </w:r>
+      <w:r>
+        <w:rPr>
+          <w:b w:val="false"/>
+          <w:bCs w:val="false"/>
+          <w:i w:val="false"/>
+          <w:iCs w:val="false"/>
+          <w:color w:val="000000"/>
+          <w:sz w:val="22"/>
+          <w:szCs w:val="22"/>
+        </w:rPr>
+        <w:t xml:space="preserve"> conferir os três destinos antes do disparo e aplicar UTM por e-mail, para separar no analytics o tráfego de cada peça. Os artigos já estão publicados e revisados, então nenhum disparo depende de produção nova.</w:t>
+      </w:r>
+    </w:p>
+    <w:p>
+      <w:pPr>
+        <w:spacing w:after="140" w:line="300"/>
+        <w:jc w:val="both"/>
+      </w:pPr>
+      <w:r>
+        <w:rPr>
+          <w:b/>
+          <w:bCs/>
+          <w:i w:val="false"/>
+          <w:iCs w:val="false"/>
+          <w:color w:val="000000"/>
+          <w:sz w:val="22"/>
+          <w:szCs w:val="22"/>
+        </w:rPr>
+        <w:t xml:space="preserve">Evolução natural:</w:t>
+      </w:r>
+      <w:r>
+        <w:rPr>
+          <w:b w:val="false"/>
+          <w:bCs w:val="false"/>
+          <w:i w:val="false"/>
+          <w:iCs w:val="false"/>
+          <w:color w:val="000000"/>
+          <w:sz w:val="22"/>
+          <w:szCs w:val="22"/>
+        </w:rPr>
+        <w:t xml:space="preserve"> quando os textos de setembro sobre a Muralha entrarem no ar, os CTAs dos E-mails 1 e 3 podem migrar para eles, que respondem à pergunta de forma mais direta. Enquanto isso, os destinos atuais entregam o que o e-mail promete.</w:t>
       </w:r>
     </w:p>
     <w:p>

</xml_diff>